<commit_message>
docs: enlazar el repositorio y el video en el documento
El apartado de reproducibilidad cierra con las dos direcciones: el repositorio,
donde están el código, los resultados y el historial de cambios, y el video con
la explicación del marco de trabajo.
</commit_message>
<xml_diff>
--- a/docs/Gonzalez_Jesus_Montecarlo.docx
+++ b/docs/Gonzalez_Jesus_Montecarlo.docx
@@ -103,7 +103,7 @@
       <w:r>
         <w:fldChar w:fldCharType="separate"/>
       </w:r>
-      <w:hyperlink w:anchor="_Toc243507972" w:history="1">
+      <w:hyperlink w:anchor="_Toc243846132" w:history="1">
         <w:r>
           <w:rPr>
             <w:rStyle w:val="Hyperlink"/>
@@ -131,7 +131,7 @@
             <w:noProof/>
             <w:webHidden/>
           </w:rPr>
-          <w:instrText xml:space="preserve"> PAGEREF _Toc243507972 \h </w:instrText>
+          <w:instrText xml:space="preserve"> PAGEREF _Toc243846132 \h </w:instrText>
         </w:r>
         <w:r>
           <w:rPr>
@@ -177,7 +177,7 @@
           <w14:ligatures w14:val="standardContextual"/>
         </w:rPr>
       </w:pPr>
-      <w:hyperlink w:anchor="_Toc243507973" w:history="1">
+      <w:hyperlink w:anchor="_Toc243846133" w:history="1">
         <w:r>
           <w:rPr>
             <w:rStyle w:val="Hyperlink"/>
@@ -205,7 +205,7 @@
             <w:noProof/>
             <w:webHidden/>
           </w:rPr>
-          <w:instrText xml:space="preserve"> PAGEREF _Toc243507973 \h </w:instrText>
+          <w:instrText xml:space="preserve"> PAGEREF _Toc243846133 \h </w:instrText>
         </w:r>
         <w:r>
           <w:rPr>
@@ -251,7 +251,7 @@
           <w14:ligatures w14:val="standardContextual"/>
         </w:rPr>
       </w:pPr>
-      <w:hyperlink w:anchor="_Toc243507974" w:history="1">
+      <w:hyperlink w:anchor="_Toc243846134" w:history="1">
         <w:r>
           <w:rPr>
             <w:rStyle w:val="Hyperlink"/>
@@ -279,7 +279,7 @@
             <w:noProof/>
             <w:webHidden/>
           </w:rPr>
-          <w:instrText xml:space="preserve"> PAGEREF _Toc243507974 \h </w:instrText>
+          <w:instrText xml:space="preserve"> PAGEREF _Toc243846134 \h </w:instrText>
         </w:r>
         <w:r>
           <w:rPr>
@@ -325,7 +325,7 @@
           <w14:ligatures w14:val="standardContextual"/>
         </w:rPr>
       </w:pPr>
-      <w:hyperlink w:anchor="_Toc243507975" w:history="1">
+      <w:hyperlink w:anchor="_Toc243846135" w:history="1">
         <w:r>
           <w:rPr>
             <w:rStyle w:val="Hyperlink"/>
@@ -353,7 +353,7 @@
             <w:noProof/>
             <w:webHidden/>
           </w:rPr>
-          <w:instrText xml:space="preserve"> PAGEREF _Toc243507975 \h </w:instrText>
+          <w:instrText xml:space="preserve"> PAGEREF _Toc243846135 \h </w:instrText>
         </w:r>
         <w:r>
           <w:rPr>
@@ -399,7 +399,7 @@
           <w14:ligatures w14:val="standardContextual"/>
         </w:rPr>
       </w:pPr>
-      <w:hyperlink w:anchor="_Toc243507976" w:history="1">
+      <w:hyperlink w:anchor="_Toc243846136" w:history="1">
         <w:r>
           <w:rPr>
             <w:rStyle w:val="Hyperlink"/>
@@ -427,7 +427,7 @@
             <w:noProof/>
             <w:webHidden/>
           </w:rPr>
-          <w:instrText xml:space="preserve"> PAGEREF _Toc243507976 \h </w:instrText>
+          <w:instrText xml:space="preserve"> PAGEREF _Toc243846136 \h </w:instrText>
         </w:r>
         <w:r>
           <w:rPr>
@@ -473,7 +473,7 @@
           <w14:ligatures w14:val="standardContextual"/>
         </w:rPr>
       </w:pPr>
-      <w:hyperlink w:anchor="_Toc243507977" w:history="1">
+      <w:hyperlink w:anchor="_Toc243846137" w:history="1">
         <w:r>
           <w:rPr>
             <w:rStyle w:val="Hyperlink"/>
@@ -501,7 +501,7 @@
             <w:noProof/>
             <w:webHidden/>
           </w:rPr>
-          <w:instrText xml:space="preserve"> PAGEREF _Toc243507977 \h </w:instrText>
+          <w:instrText xml:space="preserve"> PAGEREF _Toc243846137 \h </w:instrText>
         </w:r>
         <w:r>
           <w:rPr>
@@ -547,7 +547,7 @@
           <w14:ligatures w14:val="standardContextual"/>
         </w:rPr>
       </w:pPr>
-      <w:hyperlink w:anchor="_Toc243507978" w:history="1">
+      <w:hyperlink w:anchor="_Toc243846138" w:history="1">
         <w:r>
           <w:rPr>
             <w:rStyle w:val="Hyperlink"/>
@@ -575,7 +575,7 @@
             <w:noProof/>
             <w:webHidden/>
           </w:rPr>
-          <w:instrText xml:space="preserve"> PAGEREF _Toc243507978 \h </w:instrText>
+          <w:instrText xml:space="preserve"> PAGEREF _Toc243846138 \h </w:instrText>
         </w:r>
         <w:r>
           <w:rPr>
@@ -621,7 +621,7 @@
           <w14:ligatures w14:val="standardContextual"/>
         </w:rPr>
       </w:pPr>
-      <w:hyperlink w:anchor="_Toc243507979" w:history="1">
+      <w:hyperlink w:anchor="_Toc243846139" w:history="1">
         <w:r>
           <w:rPr>
             <w:rStyle w:val="Hyperlink"/>
@@ -649,7 +649,7 @@
             <w:noProof/>
             <w:webHidden/>
           </w:rPr>
-          <w:instrText xml:space="preserve"> PAGEREF _Toc243507979 \h </w:instrText>
+          <w:instrText xml:space="preserve"> PAGEREF _Toc243846139 \h </w:instrText>
         </w:r>
         <w:r>
           <w:rPr>
@@ -695,7 +695,7 @@
           <w14:ligatures w14:val="standardContextual"/>
         </w:rPr>
       </w:pPr>
-      <w:hyperlink w:anchor="_Toc243507980" w:history="1">
+      <w:hyperlink w:anchor="_Toc243846140" w:history="1">
         <w:r>
           <w:rPr>
             <w:rStyle w:val="Hyperlink"/>
@@ -723,7 +723,7 @@
             <w:noProof/>
             <w:webHidden/>
           </w:rPr>
-          <w:instrText xml:space="preserve"> PAGEREF _Toc243507980 \h </w:instrText>
+          <w:instrText xml:space="preserve"> PAGEREF _Toc243846140 \h </w:instrText>
         </w:r>
         <w:r>
           <w:rPr>
@@ -769,7 +769,7 @@
           <w14:ligatures w14:val="standardContextual"/>
         </w:rPr>
       </w:pPr>
-      <w:hyperlink w:anchor="_Toc243507981" w:history="1">
+      <w:hyperlink w:anchor="_Toc243846141" w:history="1">
         <w:r>
           <w:rPr>
             <w:rStyle w:val="Hyperlink"/>
@@ -797,7 +797,7 @@
             <w:noProof/>
             <w:webHidden/>
           </w:rPr>
-          <w:instrText xml:space="preserve"> PAGEREF _Toc243507981 \h </w:instrText>
+          <w:instrText xml:space="preserve"> PAGEREF _Toc243846141 \h </w:instrText>
         </w:r>
         <w:r>
           <w:rPr>
@@ -843,7 +843,7 @@
           <w14:ligatures w14:val="standardContextual"/>
         </w:rPr>
       </w:pPr>
-      <w:hyperlink w:anchor="_Toc243507982" w:history="1">
+      <w:hyperlink w:anchor="_Toc243846142" w:history="1">
         <w:r>
           <w:rPr>
             <w:rStyle w:val="Hyperlink"/>
@@ -871,7 +871,7 @@
             <w:noProof/>
             <w:webHidden/>
           </w:rPr>
-          <w:instrText xml:space="preserve"> PAGEREF _Toc243507982 \h </w:instrText>
+          <w:instrText xml:space="preserve"> PAGEREF _Toc243846142 \h </w:instrText>
         </w:r>
         <w:r>
           <w:rPr>
@@ -917,7 +917,7 @@
           <w14:ligatures w14:val="standardContextual"/>
         </w:rPr>
       </w:pPr>
-      <w:hyperlink w:anchor="_Toc243507983" w:history="1">
+      <w:hyperlink w:anchor="_Toc243846143" w:history="1">
         <w:r>
           <w:rPr>
             <w:rStyle w:val="Hyperlink"/>
@@ -945,7 +945,7 @@
             <w:noProof/>
             <w:webHidden/>
           </w:rPr>
-          <w:instrText xml:space="preserve"> PAGEREF _Toc243507983 \h </w:instrText>
+          <w:instrText xml:space="preserve"> PAGEREF _Toc243846143 \h </w:instrText>
         </w:r>
         <w:r>
           <w:rPr>
@@ -991,7 +991,7 @@
           <w14:ligatures w14:val="standardContextual"/>
         </w:rPr>
       </w:pPr>
-      <w:hyperlink w:anchor="_Toc243507984" w:history="1">
+      <w:hyperlink w:anchor="_Toc243846144" w:history="1">
         <w:r>
           <w:rPr>
             <w:rStyle w:val="Hyperlink"/>
@@ -1019,7 +1019,7 @@
             <w:noProof/>
             <w:webHidden/>
           </w:rPr>
-          <w:instrText xml:space="preserve"> PAGEREF _Toc243507984 \h </w:instrText>
+          <w:instrText xml:space="preserve"> PAGEREF _Toc243846144 \h </w:instrText>
         </w:r>
         <w:r>
           <w:rPr>
@@ -1065,7 +1065,7 @@
           <w14:ligatures w14:val="standardContextual"/>
         </w:rPr>
       </w:pPr>
-      <w:hyperlink w:anchor="_Toc243507985" w:history="1">
+      <w:hyperlink w:anchor="_Toc243846145" w:history="1">
         <w:r>
           <w:rPr>
             <w:rStyle w:val="Hyperlink"/>
@@ -1093,7 +1093,7 @@
             <w:noProof/>
             <w:webHidden/>
           </w:rPr>
-          <w:instrText xml:space="preserve"> PAGEREF _Toc243507985 \h </w:instrText>
+          <w:instrText xml:space="preserve"> PAGEREF _Toc243846145 \h </w:instrText>
         </w:r>
         <w:r>
           <w:rPr>
@@ -1139,7 +1139,7 @@
           <w14:ligatures w14:val="standardContextual"/>
         </w:rPr>
       </w:pPr>
-      <w:hyperlink w:anchor="_Toc243507986" w:history="1">
+      <w:hyperlink w:anchor="_Toc243846146" w:history="1">
         <w:r>
           <w:rPr>
             <w:rStyle w:val="Hyperlink"/>
@@ -1167,7 +1167,7 @@
             <w:noProof/>
             <w:webHidden/>
           </w:rPr>
-          <w:instrText xml:space="preserve"> PAGEREF _Toc243507986 \h </w:instrText>
+          <w:instrText xml:space="preserve"> PAGEREF _Toc243846146 \h </w:instrText>
         </w:r>
         <w:r>
           <w:rPr>
@@ -1213,7 +1213,7 @@
           <w14:ligatures w14:val="standardContextual"/>
         </w:rPr>
       </w:pPr>
-      <w:hyperlink w:anchor="_Toc243507987" w:history="1">
+      <w:hyperlink w:anchor="_Toc243846147" w:history="1">
         <w:r>
           <w:rPr>
             <w:rStyle w:val="Hyperlink"/>
@@ -1241,7 +1241,7 @@
             <w:noProof/>
             <w:webHidden/>
           </w:rPr>
-          <w:instrText xml:space="preserve"> PAGEREF _Toc243507987 \h </w:instrText>
+          <w:instrText xml:space="preserve"> PAGEREF _Toc243846147 \h </w:instrText>
         </w:r>
         <w:r>
           <w:rPr>
@@ -1287,7 +1287,7 @@
           <w14:ligatures w14:val="standardContextual"/>
         </w:rPr>
       </w:pPr>
-      <w:hyperlink w:anchor="_Toc243507988" w:history="1">
+      <w:hyperlink w:anchor="_Toc243846148" w:history="1">
         <w:r>
           <w:rPr>
             <w:rStyle w:val="Hyperlink"/>
@@ -1315,7 +1315,7 @@
             <w:noProof/>
             <w:webHidden/>
           </w:rPr>
-          <w:instrText xml:space="preserve"> PAGEREF _Toc243507988 \h </w:instrText>
+          <w:instrText xml:space="preserve"> PAGEREF _Toc243846148 \h </w:instrText>
         </w:r>
         <w:r>
           <w:rPr>
@@ -1361,7 +1361,7 @@
           <w14:ligatures w14:val="standardContextual"/>
         </w:rPr>
       </w:pPr>
-      <w:hyperlink w:anchor="_Toc243507989" w:history="1">
+      <w:hyperlink w:anchor="_Toc243846149" w:history="1">
         <w:r>
           <w:rPr>
             <w:rStyle w:val="Hyperlink"/>
@@ -1389,7 +1389,7 @@
             <w:noProof/>
             <w:webHidden/>
           </w:rPr>
-          <w:instrText xml:space="preserve"> PAGEREF _Toc243507989 \h </w:instrText>
+          <w:instrText xml:space="preserve"> PAGEREF _Toc243846149 \h </w:instrText>
         </w:r>
         <w:r>
           <w:rPr>
@@ -1445,7 +1445,7 @@
       <w:pPr>
         <w:pStyle w:val="Heading1"/>
       </w:pPr>
-      <w:bookmarkStart w:id="0" w:name="_Toc243507972"/>
+      <w:bookmarkStart w:id="0" w:name="_Toc243846132"/>
       <w:r>
         <w:rPr>
           <w:rFonts w:ascii="Times New Roman" w:eastAsia="Times New Roman" w:hAnsi="Times New Roman" w:cs="Times New Roman"/>
@@ -1517,7 +1517,7 @@
       <w:pPr>
         <w:pStyle w:val="Heading1"/>
       </w:pPr>
-      <w:bookmarkStart w:id="1" w:name="_Toc243507973"/>
+      <w:bookmarkStart w:id="1" w:name="_Toc243846133"/>
       <w:r>
         <w:rPr>
           <w:rFonts w:ascii="Times New Roman" w:eastAsia="Times New Roman" w:hAnsi="Times New Roman" w:cs="Times New Roman"/>
@@ -1530,7 +1530,7 @@
       <w:pPr>
         <w:pStyle w:val="Heading2"/>
       </w:pPr>
-      <w:bookmarkStart w:id="2" w:name="_Toc243507974"/>
+      <w:bookmarkStart w:id="2" w:name="_Toc243846134"/>
       <w:r>
         <w:rPr>
           <w:rFonts w:ascii="Times New Roman" w:eastAsia="Times New Roman" w:hAnsi="Times New Roman" w:cs="Times New Roman"/>
@@ -2253,7 +2253,7 @@
       <w:pPr>
         <w:pStyle w:val="Heading2"/>
       </w:pPr>
-      <w:bookmarkStart w:id="3" w:name="_Toc243507975"/>
+      <w:bookmarkStart w:id="3" w:name="_Toc243846135"/>
       <w:r>
         <w:rPr>
           <w:rFonts w:ascii="Times New Roman" w:eastAsia="Times New Roman" w:hAnsi="Times New Roman" w:cs="Times New Roman"/>
@@ -3013,7 +3013,7 @@
       <w:pPr>
         <w:pStyle w:val="Heading2"/>
       </w:pPr>
-      <w:bookmarkStart w:id="4" w:name="_Toc243507976"/>
+      <w:bookmarkStart w:id="4" w:name="_Toc243846136"/>
       <w:r>
         <w:rPr>
           <w:rFonts w:ascii="Times New Roman" w:eastAsia="Times New Roman" w:hAnsi="Times New Roman" w:cs="Times New Roman"/>
@@ -3334,7 +3334,7 @@
       <w:pPr>
         <w:pStyle w:val="Heading2"/>
       </w:pPr>
-      <w:bookmarkStart w:id="5" w:name="_Toc243507977"/>
+      <w:bookmarkStart w:id="5" w:name="_Toc243846137"/>
       <w:r>
         <w:rPr>
           <w:rFonts w:ascii="Times New Roman" w:eastAsia="Times New Roman" w:hAnsi="Times New Roman" w:cs="Times New Roman"/>
@@ -3367,7 +3367,7 @@
       <w:pPr>
         <w:pStyle w:val="Heading2"/>
       </w:pPr>
-      <w:bookmarkStart w:id="6" w:name="_Toc243507978"/>
+      <w:bookmarkStart w:id="6" w:name="_Toc243846138"/>
       <w:r>
         <w:rPr>
           <w:rFonts w:ascii="Times New Roman" w:eastAsia="Times New Roman" w:hAnsi="Times New Roman" w:cs="Times New Roman"/>
@@ -3419,7 +3419,7 @@
       <w:pPr>
         <w:pStyle w:val="Heading2"/>
       </w:pPr>
-      <w:bookmarkStart w:id="7" w:name="_Toc243507979"/>
+      <w:bookmarkStart w:id="7" w:name="_Toc243846139"/>
       <w:r>
         <w:rPr>
           <w:rFonts w:ascii="Times New Roman" w:eastAsia="Times New Roman" w:hAnsi="Times New Roman" w:cs="Times New Roman"/>
@@ -3520,9 +3520,39 @@
     </w:p>
     <w:p>
       <w:pPr>
+        <w:ind w:firstLine="720"/>
+      </w:pPr>
+      <w:r>
+        <w:t xml:space="preserve">El código, los resultados y este documento están publicados en </w:t>
+      </w:r>
+      <w:hyperlink r:id="rId8">
+        <w:r>
+          <w:rPr>
+            <w:u w:val="single"/>
+          </w:rPr>
+          <w:t>https://github.com/jesusjoelgonca/simulacion-montecarlo-yahtzee</w:t>
+        </w:r>
+      </w:hyperlink>
+      <w:r>
+        <w:t xml:space="preserve">, donde también está el historial de cambios que separa las tres fases. La explicación en video del marco de trabajo, de las modificaciones y de la comprobación de la ley de los grandes números está disponible en </w:t>
+      </w:r>
+      <w:hyperlink r:id="rId9">
+        <w:r>
+          <w:rPr>
+            <w:u w:val="single"/>
+          </w:rPr>
+          <w:t>https://drive.google.com/file/d/1_h8mTJk--5Y3tUZFwX4pPxk8BS7Uj8JA/view?usp=sharing</w:t>
+        </w:r>
+      </w:hyperlink>
+      <w:r>
+        <w:t>.</w:t>
+      </w:r>
+    </w:p>
+    <w:p>
+      <w:pPr>
         <w:pStyle w:val="Heading1"/>
       </w:pPr>
-      <w:bookmarkStart w:id="8" w:name="_Toc243507980"/>
+      <w:bookmarkStart w:id="8" w:name="_Toc243846140"/>
       <w:r>
         <w:rPr>
           <w:rFonts w:ascii="Times New Roman" w:eastAsia="Times New Roman" w:hAnsi="Times New Roman" w:cs="Times New Roman"/>
@@ -3535,7 +3565,7 @@
       <w:pPr>
         <w:pStyle w:val="Heading2"/>
       </w:pPr>
-      <w:bookmarkStart w:id="9" w:name="_Toc243507981"/>
+      <w:bookmarkStart w:id="9" w:name="_Toc243846141"/>
       <w:r>
         <w:rPr>
           <w:rFonts w:ascii="Times New Roman" w:eastAsia="Times New Roman" w:hAnsi="Times New Roman" w:cs="Times New Roman"/>
@@ -3549,7 +3579,11 @@
         <w:ind w:firstLine="720"/>
       </w:pPr>
       <w:r>
-        <w:t>La Tabla 3 presenta la probabilidad exacta de cada categoría en un solo lanzamiento, calculada por enumeración de los 7776 resultados posibles. La columna de casos favorables permite reconstruir el cálculo y la última columna traduce la probabilidad a una frecuencia intuitiva: uno de cada cuántos lanzamientos cumple la condición.</w:t>
+        <w:t xml:space="preserve">La Tabla 3 presenta la probabilidad exacta de cada categoría en un solo lanzamiento, calculada por enumeración de los 7776 resultados posibles. La columna de casos favorables </w:t>
+      </w:r>
+      <w:r>
+        <w:lastRenderedPageBreak/>
+        <w:t>permite reconstruir el cálculo y la última columna traduce la probabilidad a una frecuencia intuitiva: uno de cada cuántos lanzamientos cumple la condición.</w:t>
       </w:r>
     </w:p>
     <w:p>
@@ -3561,7 +3595,6 @@
         <w:rPr>
           <w:b/>
         </w:rPr>
-        <w:lastRenderedPageBreak/>
         <w:t>Tabla 3</w:t>
       </w:r>
     </w:p>
@@ -4666,11 +4699,11 @@
         <w:ind w:firstLine="720"/>
       </w:pPr>
       <w:r>
-        <w:t xml:space="preserve">Los casos del trío merecen una aclaración, porque la regla admite al menos tres iguales. Los 1656 resultados se descomponen en 1500 tiradas con exactamente tres dados iguales, 150 con exactamente cuatro y 6 con los cinco. El póker, que exige al menos cuatro, suma 156: las 150 de cuatro iguales y las 6 del Yahtzee. El full house, en cambio, exige la combinación exacta y por eso solo cuenta 300, todas ellas dentro de las 1500 del trío. Esta es la razón por la que las </w:t>
+        <w:t xml:space="preserve">Los casos del trío merecen una aclaración, porque la regla admite al menos tres iguales. Los 1656 resultados se descomponen en 1500 tiradas con exactamente tres dados iguales, 150 con exactamente cuatro y 6 con los cinco. El póker, que exige al menos cuatro, suma 156: las </w:t>
       </w:r>
       <w:r>
         <w:lastRenderedPageBreak/>
-        <w:t>probabilidades de la tabla no suman uno: las categorías se solapan y una misma tirada puede cumplir varias condiciones a la vez.</w:t>
+        <w:t>150 de cuatro iguales y las 6 del Yahtzee. El full house, en cambio, exige la combinación exacta y por eso solo cuenta 300, todas ellas dentro de las 1500 del trío. Esta es la razón por la que las probabilidades de la tabla no suman uno: las categorías se solapan y una misma tirada puede cumplir varias condiciones a la vez.</w:t>
       </w:r>
     </w:p>
     <w:p>
@@ -4707,7 +4740,7 @@
           <w:noProof/>
         </w:rPr>
         <w:drawing>
-          <wp:inline distT="0" distB="0" distL="0" distR="0" wp14:anchorId="72BDA347" wp14:editId="702DBFB8">
+          <wp:inline distT="0" distB="0" distL="0" distR="0" wp14:anchorId="4BE38F54" wp14:editId="73FE5C4F">
             <wp:extent cx="5760720" cy="3357109"/>
             <wp:effectExtent l="0" t="0" r="0" b="0"/>
             <wp:docPr id="1" name="Picture 1"/>
@@ -4722,7 +4755,7 @@
                     <pic:cNvPicPr/>
                   </pic:nvPicPr>
                   <pic:blipFill>
-                    <a:blip r:embed="rId8"/>
+                    <a:blip r:embed="rId10"/>
                     <a:stretch>
                       <a:fillRect/>
                     </a:stretch>
@@ -4773,7 +4806,7 @@
       <w:pPr>
         <w:pStyle w:val="Heading2"/>
       </w:pPr>
-      <w:bookmarkStart w:id="10" w:name="_Toc243507982"/>
+      <w:bookmarkStart w:id="10" w:name="_Toc243846142"/>
       <w:r>
         <w:rPr>
           <w:rFonts w:ascii="Times New Roman" w:eastAsia="Times New Roman" w:hAnsi="Times New Roman" w:cs="Times New Roman"/>
@@ -5368,7 +5401,7 @@
           <w:noProof/>
         </w:rPr>
         <w:drawing>
-          <wp:inline distT="0" distB="0" distL="0" distR="0" wp14:anchorId="2620E976" wp14:editId="57A911D5">
+          <wp:inline distT="0" distB="0" distL="0" distR="0" wp14:anchorId="002837E4" wp14:editId="21F4DC9A">
             <wp:extent cx="5760720" cy="3542661"/>
             <wp:effectExtent l="0" t="0" r="0" b="0"/>
             <wp:docPr id="2" name="Picture 2"/>
@@ -5383,7 +5416,7 @@
                     <pic:cNvPicPr/>
                   </pic:nvPicPr>
                   <pic:blipFill>
-                    <a:blip r:embed="rId9"/>
+                    <a:blip r:embed="rId11"/>
                     <a:stretch>
                       <a:fillRect/>
                     </a:stretch>
@@ -5434,7 +5467,7 @@
       <w:pPr>
         <w:pStyle w:val="Heading2"/>
       </w:pPr>
-      <w:bookmarkStart w:id="11" w:name="_Toc243507983"/>
+      <w:bookmarkStart w:id="11" w:name="_Toc243846143"/>
       <w:r>
         <w:rPr>
           <w:rFonts w:ascii="Times New Roman" w:eastAsia="Times New Roman" w:hAnsi="Times New Roman" w:cs="Times New Roman"/>
@@ -5507,7 +5540,7 @@
           <w:noProof/>
         </w:rPr>
         <w:drawing>
-          <wp:inline distT="0" distB="0" distL="0" distR="0" wp14:anchorId="0C1DFA8A" wp14:editId="752131A8">
+          <wp:inline distT="0" distB="0" distL="0" distR="0" wp14:anchorId="49BFD152" wp14:editId="5ECE02B1">
             <wp:extent cx="5760720" cy="3565164"/>
             <wp:effectExtent l="0" t="0" r="0" b="0"/>
             <wp:docPr id="3" name="Picture 3"/>
@@ -5522,7 +5555,7 @@
                     <pic:cNvPicPr/>
                   </pic:nvPicPr>
                   <pic:blipFill>
-                    <a:blip r:embed="rId10"/>
+                    <a:blip r:embed="rId12"/>
                     <a:stretch>
                       <a:fillRect/>
                     </a:stretch>
@@ -5606,7 +5639,7 @@
       <w:pPr>
         <w:pStyle w:val="Heading2"/>
       </w:pPr>
-      <w:bookmarkStart w:id="12" w:name="_Toc243507984"/>
+      <w:bookmarkStart w:id="12" w:name="_Toc243846144"/>
       <w:r>
         <w:rPr>
           <w:rFonts w:ascii="Times New Roman" w:eastAsia="Times New Roman" w:hAnsi="Times New Roman" w:cs="Times New Roman"/>
@@ -6520,7 +6553,7 @@
           <w:noProof/>
         </w:rPr>
         <w:drawing>
-          <wp:inline distT="0" distB="0" distL="0" distR="0" wp14:anchorId="157AFCB6" wp14:editId="2A3D7D34">
+          <wp:inline distT="0" distB="0" distL="0" distR="0" wp14:anchorId="204A1A38" wp14:editId="55DC889F">
             <wp:extent cx="5760720" cy="3682763"/>
             <wp:effectExtent l="0" t="0" r="0" b="0"/>
             <wp:docPr id="4" name="Picture 4"/>
@@ -6535,7 +6568,7 @@
                     <pic:cNvPicPr/>
                   </pic:nvPicPr>
                   <pic:blipFill>
-                    <a:blip r:embed="rId11"/>
+                    <a:blip r:embed="rId13"/>
                     <a:stretch>
                       <a:fillRect/>
                     </a:stretch>
@@ -6601,7 +6634,7 @@
       <w:pPr>
         <w:pStyle w:val="Heading2"/>
       </w:pPr>
-      <w:bookmarkStart w:id="13" w:name="_Toc243507985"/>
+      <w:bookmarkStart w:id="13" w:name="_Toc243846145"/>
       <w:r>
         <w:rPr>
           <w:rFonts w:ascii="Times New Roman" w:eastAsia="Times New Roman" w:hAnsi="Times New Roman" w:cs="Times New Roman"/>
@@ -7461,7 +7494,7 @@
           <w:noProof/>
         </w:rPr>
         <w:drawing>
-          <wp:inline distT="0" distB="0" distL="0" distR="0" wp14:anchorId="13F8F861" wp14:editId="515D5576">
+          <wp:inline distT="0" distB="0" distL="0" distR="0" wp14:anchorId="08721109" wp14:editId="1B042E82">
             <wp:extent cx="5760720" cy="3270145"/>
             <wp:effectExtent l="0" t="0" r="0" b="0"/>
             <wp:docPr id="5" name="Picture 5"/>
@@ -7476,7 +7509,7 @@
                     <pic:cNvPicPr/>
                   </pic:nvPicPr>
                   <pic:blipFill>
-                    <a:blip r:embed="rId12"/>
+                    <a:blip r:embed="rId14"/>
                     <a:stretch>
                       <a:fillRect/>
                     </a:stretch>
@@ -7530,7 +7563,7 @@
       <w:pPr>
         <w:pStyle w:val="Heading2"/>
       </w:pPr>
-      <w:bookmarkStart w:id="14" w:name="_Toc243507986"/>
+      <w:bookmarkStart w:id="14" w:name="_Toc243846146"/>
       <w:r>
         <w:rPr>
           <w:rFonts w:ascii="Times New Roman" w:eastAsia="Times New Roman" w:hAnsi="Times New Roman" w:cs="Times New Roman"/>
@@ -8224,7 +8257,7 @@
           <w:noProof/>
         </w:rPr>
         <w:drawing>
-          <wp:inline distT="0" distB="0" distL="0" distR="0" wp14:anchorId="04A480DD" wp14:editId="35F04E77">
+          <wp:inline distT="0" distB="0" distL="0" distR="0" wp14:anchorId="0A78F976" wp14:editId="5E06DB3D">
             <wp:extent cx="5760720" cy="3523597"/>
             <wp:effectExtent l="0" t="0" r="0" b="0"/>
             <wp:docPr id="6" name="Picture 6"/>
@@ -8239,7 +8272,7 @@
                     <pic:cNvPicPr/>
                   </pic:nvPicPr>
                   <pic:blipFill>
-                    <a:blip r:embed="rId13"/>
+                    <a:blip r:embed="rId15"/>
                     <a:stretch>
                       <a:fillRect/>
                     </a:stretch>
@@ -8362,7 +8395,7 @@
       <w:pPr>
         <w:pStyle w:val="Heading2"/>
       </w:pPr>
-      <w:bookmarkStart w:id="15" w:name="_Toc243507987"/>
+      <w:bookmarkStart w:id="15" w:name="_Toc243846147"/>
       <w:r>
         <w:rPr>
           <w:rFonts w:ascii="Times New Roman" w:eastAsia="Times New Roman" w:hAnsi="Times New Roman" w:cs="Times New Roman"/>
@@ -8438,7 +8471,7 @@
       <w:pPr>
         <w:pStyle w:val="Heading1"/>
       </w:pPr>
-      <w:bookmarkStart w:id="16" w:name="_Toc243507988"/>
+      <w:bookmarkStart w:id="16" w:name="_Toc243846148"/>
       <w:r>
         <w:rPr>
           <w:rFonts w:ascii="Times New Roman" w:eastAsia="Times New Roman" w:hAnsi="Times New Roman" w:cs="Times New Roman"/>
@@ -8522,7 +8555,7 @@
         <w:pStyle w:val="Heading1"/>
         <w:pageBreakBefore/>
       </w:pPr>
-      <w:bookmarkStart w:id="17" w:name="_Toc243507989"/>
+      <w:bookmarkStart w:id="17" w:name="_Toc243846149"/>
       <w:r>
         <w:rPr>
           <w:rFonts w:ascii="Times New Roman" w:eastAsia="Times New Roman" w:hAnsi="Times New Roman" w:cs="Times New Roman"/>
@@ -8548,7 +8581,7 @@
       <w:r>
         <w:t xml:space="preserve"> (7.ª ed.). </w:t>
       </w:r>
-      <w:hyperlink r:id="rId14">
+      <w:hyperlink r:id="rId16">
         <w:r>
           <w:rPr>
             <w:u w:val="single"/>
@@ -8658,7 +8691,7 @@
       <w:r>
         <w:t xml:space="preserve">(247), 335-341. </w:t>
       </w:r>
-      <w:hyperlink r:id="rId15">
+      <w:hyperlink r:id="rId17">
         <w:r>
           <w:rPr>
             <w:u w:val="single"/>
@@ -8683,7 +8716,7 @@
       <w:r>
         <w:t xml:space="preserve">. National Institute of Standards and Technology. </w:t>
       </w:r>
-      <w:hyperlink r:id="rId16">
+      <w:hyperlink r:id="rId18">
         <w:r>
           <w:rPr>
             <w:u w:val="single"/>
@@ -8759,7 +8792,7 @@
       <w:r>
         <w:t xml:space="preserve">. </w:t>
       </w:r>
-      <w:hyperlink r:id="rId17">
+      <w:hyperlink r:id="rId19">
         <w:r>
           <w:rPr>
             <w:u w:val="single"/>
@@ -8769,7 +8802,7 @@
       </w:hyperlink>
     </w:p>
     <w:sectPr>
-      <w:headerReference w:type="default" r:id="rId18"/>
+      <w:headerReference w:type="default" r:id="rId20"/>
       <w:pgSz w:w="12240" w:h="15840"/>
       <w:pgMar w:top="1440" w:right="1440" w:bottom="1440" w:left="1440" w:header="720" w:footer="720" w:gutter="0"/>
       <w:cols w:space="720"/>
@@ -9028,31 +9061,31 @@
       </w:rPr>
     </w:lvl>
   </w:abstractNum>
-  <w:num w:numId="1" w16cid:durableId="198863696">
+  <w:num w:numId="1" w16cid:durableId="1609192761">
     <w:abstractNumId w:val="8"/>
   </w:num>
-  <w:num w:numId="2" w16cid:durableId="1773165934">
+  <w:num w:numId="2" w16cid:durableId="1780754450">
     <w:abstractNumId w:val="6"/>
   </w:num>
-  <w:num w:numId="3" w16cid:durableId="1281182814">
+  <w:num w:numId="3" w16cid:durableId="975450561">
     <w:abstractNumId w:val="5"/>
   </w:num>
-  <w:num w:numId="4" w16cid:durableId="561139479">
+  <w:num w:numId="4" w16cid:durableId="441728991">
     <w:abstractNumId w:val="4"/>
   </w:num>
-  <w:num w:numId="5" w16cid:durableId="1400008824">
+  <w:num w:numId="5" w16cid:durableId="1239821883">
     <w:abstractNumId w:val="7"/>
   </w:num>
-  <w:num w:numId="6" w16cid:durableId="1857231164">
+  <w:num w:numId="6" w16cid:durableId="820733211">
     <w:abstractNumId w:val="3"/>
   </w:num>
-  <w:num w:numId="7" w16cid:durableId="657459814">
+  <w:num w:numId="7" w16cid:durableId="1180122187">
     <w:abstractNumId w:val="2"/>
   </w:num>
-  <w:num w:numId="8" w16cid:durableId="573468271">
+  <w:num w:numId="8" w16cid:durableId="939795884">
     <w:abstractNumId w:val="1"/>
   </w:num>
-  <w:num w:numId="9" w16cid:durableId="654115794">
+  <w:num w:numId="9" w16cid:durableId="1036809305">
     <w:abstractNumId w:val="0"/>
   </w:num>
 </w:numbering>
@@ -20446,7 +20479,7 @@
     <w:autoRedefine/>
     <w:uiPriority w:val="39"/>
     <w:unhideWhenUsed/>
-    <w:rsid w:val="00CC0B95"/>
+    <w:rsid w:val="001A200D"/>
     <w:pPr>
       <w:spacing w:after="100"/>
     </w:pPr>
@@ -20458,7 +20491,7 @@
     <w:autoRedefine/>
     <w:uiPriority w:val="39"/>
     <w:unhideWhenUsed/>
-    <w:rsid w:val="00CC0B95"/>
+    <w:rsid w:val="001A200D"/>
     <w:pPr>
       <w:spacing w:after="100"/>
       <w:ind w:left="240"/>
@@ -20469,7 +20502,7 @@
     <w:basedOn w:val="DefaultParagraphFont"/>
     <w:uiPriority w:val="99"/>
     <w:unhideWhenUsed/>
-    <w:rsid w:val="00CC0B95"/>
+    <w:rsid w:val="001A200D"/>
     <w:rPr>
       <w:color w:val="0000FF" w:themeColor="hyperlink"/>
       <w:u w:val="single"/>

</xml_diff>